<commit_message>
Add packaged FlashRank release
</commit_message>
<xml_diff>
--- a/docs/flashrank-build-report.docx
+++ b/docs/flashrank-build-report.docx
@@ -4465,11 +4465,19 @@
           <w:rFonts w:cs="Arial"/>
         </w:rPr>
       </w:pPr>
-      <w:r>
-        <w:rPr>
-          <w:rFonts w:cs="Arial"/>
-        </w:rPr>
-        <w:t>FlashRank is a desktop-style App Store Optimization, or ASO, studio for iOS app developers, indie founders, marketers, and product teams who want to understand how their apps appear in App Store search.</w:t>
+      <w:proofErr w:type="spellStart"/>
+      <w:r>
+        <w:rPr>
+          <w:rFonts w:cs="Arial"/>
+        </w:rPr>
+        <w:t>FlashRank</w:t>
+      </w:r>
+      <w:proofErr w:type="spellEnd"/>
+      <w:r>
+        <w:rPr>
+          <w:rFonts w:cs="Arial"/>
+        </w:rPr>
+        <w:t xml:space="preserve"> is a desktop-style App Store Optimization, or ASO, studio for iOS app developers, indie founders, marketers, and product teams who want to understand how their apps appear in App Store search.</w:t>
       </w:r>
     </w:p>
     <w:p>
@@ -4491,24 +4499,88 @@
           <w:rFonts w:cs="Arial"/>
         </w:rPr>
       </w:pPr>
-      <w:r>
-        <w:rPr>
-          <w:rFonts w:cs="Arial"/>
-        </w:rPr>
-        <w:t>FlashRank was built as a web app using Next.js, React, TypeScript, Zustand, and server-side API routes. The current build prioritizes free and public App Store data first, while keeping the infrastructure ready for private Apple integrations such as App Store Connect, Apple Search Ads, DeepL, and future billing.</w:t>
-      </w:r>
-    </w:p>
-    <w:p>
-      <w:pPr>
-        <w:rPr>
-          <w:rFonts w:cs="Arial"/>
-        </w:rPr>
-      </w:pPr>
-      <w:r>
-        <w:rPr>
-          <w:rFonts w:cs="Arial"/>
-        </w:rPr>
-        <w:t>The most important engineering choice in FlashRank is honesty about data. Apple does not expose every ASO or business metric publicly. Metrics such as downloads, impressions, product page views, conversion rate, revenue, exact keyword search volume, and real Apple Search Ads popularity require authenticated APIs and account permissions. FlashRank therefore separates public ranking intelligence from private metrics, labels estimated values clearly, and avoids pretending that unavailable data is exact.</w:t>
+      <w:proofErr w:type="spellStart"/>
+      <w:r>
+        <w:rPr>
+          <w:rFonts w:cs="Arial"/>
+        </w:rPr>
+        <w:t>FlashRank</w:t>
+      </w:r>
+      <w:proofErr w:type="spellEnd"/>
+      <w:r>
+        <w:rPr>
+          <w:rFonts w:cs="Arial"/>
+        </w:rPr>
+        <w:t xml:space="preserve"> was built as a web app using Next.js, React, TypeScript, </w:t>
+      </w:r>
+      <w:proofErr w:type="spellStart"/>
+      <w:r>
+        <w:rPr>
+          <w:rFonts w:cs="Arial"/>
+        </w:rPr>
+        <w:t>Zustand</w:t>
+      </w:r>
+      <w:proofErr w:type="spellEnd"/>
+      <w:r>
+        <w:rPr>
+          <w:rFonts w:cs="Arial"/>
+        </w:rPr>
+        <w:t xml:space="preserve">, and server-side API routes. The current build prioritizes free and public App Store data first, while keeping the infrastructure ready for private Apple integrations such as App Store Connect, Apple Search Ads, </w:t>
+      </w:r>
+      <w:proofErr w:type="spellStart"/>
+      <w:r>
+        <w:rPr>
+          <w:rFonts w:cs="Arial"/>
+        </w:rPr>
+        <w:t>DeepL</w:t>
+      </w:r>
+      <w:proofErr w:type="spellEnd"/>
+      <w:r>
+        <w:rPr>
+          <w:rFonts w:cs="Arial"/>
+        </w:rPr>
+        <w:t>, and future billing.</w:t>
+      </w:r>
+    </w:p>
+    <w:p>
+      <w:pPr>
+        <w:rPr>
+          <w:rFonts w:cs="Arial"/>
+        </w:rPr>
+      </w:pPr>
+      <w:r>
+        <w:rPr>
+          <w:rFonts w:cs="Arial"/>
+        </w:rPr>
+        <w:t xml:space="preserve">The most important engineering choice in </w:t>
+      </w:r>
+      <w:proofErr w:type="spellStart"/>
+      <w:r>
+        <w:rPr>
+          <w:rFonts w:cs="Arial"/>
+        </w:rPr>
+        <w:t>FlashRank</w:t>
+      </w:r>
+      <w:proofErr w:type="spellEnd"/>
+      <w:r>
+        <w:rPr>
+          <w:rFonts w:cs="Arial"/>
+        </w:rPr>
+        <w:t xml:space="preserve"> is honesty about data. Apple does not expose every ASO or business metric publicly. Metrics such as downloads, impressions, product page views, conversion rate, revenue, exact keyword search volume, and real Apple Search Ads popularity require authenticated APIs and account permissions. </w:t>
+      </w:r>
+      <w:proofErr w:type="spellStart"/>
+      <w:r>
+        <w:rPr>
+          <w:rFonts w:cs="Arial"/>
+        </w:rPr>
+        <w:t>FlashRank</w:t>
+      </w:r>
+      <w:proofErr w:type="spellEnd"/>
+      <w:r>
+        <w:rPr>
+          <w:rFonts w:cs="Arial"/>
+        </w:rPr>
+        <w:t xml:space="preserve"> therefore separates public ranking intelligence from private metrics, labels estimated values clearly, and avoids pretending that unavailable data is exact.</w:t>
       </w:r>
     </w:p>
     <w:p>
@@ -4518,6 +4590,7 @@
           <w:rFonts w:cs="Arial"/>
         </w:rPr>
       </w:pPr>
+      <w:proofErr w:type="spellStart"/>
       <w:r>
         <w:rPr>
           <w:rFonts w:cs="Arial"/>
@@ -4525,7 +4598,17 @@
           <w:color w:val="4B5563"/>
           <w:sz w:val="18"/>
         </w:rPr>
-        <w:t>FlashRank keyword table with tracked app rankings</w:t>
+        <w:t>FlashRank</w:t>
+      </w:r>
+      <w:proofErr w:type="spellEnd"/>
+      <w:r>
+        <w:rPr>
+          <w:rFonts w:cs="Arial"/>
+          <w:i/>
+          <w:color w:val="4B5563"/>
+          <w:sz w:val="18"/>
+        </w:rPr>
+        <w:t xml:space="preserve"> keyword table with tracked app rankings</w:t>
       </w:r>
     </w:p>
     <w:p>
@@ -4603,7 +4686,21 @@
           <w:rFonts w:ascii="Arial" w:hAnsi="Arial" w:cs="Arial"/>
         </w:rPr>
         <w:lastRenderedPageBreak/>
-        <w:t>The Problem FlashRank Solves</w:t>
+        <w:t xml:space="preserve">The Problem </w:t>
+      </w:r>
+      <w:proofErr w:type="spellStart"/>
+      <w:r>
+        <w:rPr>
+          <w:rFonts w:ascii="Arial" w:hAnsi="Arial" w:cs="Arial"/>
+        </w:rPr>
+        <w:t>FlashRank</w:t>
+      </w:r>
+      <w:proofErr w:type="spellEnd"/>
+      <w:r>
+        <w:rPr>
+          <w:rFonts w:ascii="Arial" w:hAnsi="Arial" w:cs="Arial"/>
+        </w:rPr>
+        <w:t xml:space="preserve"> Solves</w:t>
       </w:r>
       <w:bookmarkEnd w:id="2"/>
     </w:p>
@@ -4735,11 +4832,19 @@
           <w:rFonts w:cs="Arial"/>
         </w:rPr>
       </w:pPr>
-      <w:r>
-        <w:rPr>
-          <w:rFonts w:cs="Arial"/>
-        </w:rPr>
-        <w:t>FlashRank tackles the public side of this problem. It lets users inspect what Apple publicly returns for keyword searches, track where their app appears, compare competitor positions, and build better keyword lists from observable ranking behavior.</w:t>
+      <w:proofErr w:type="spellStart"/>
+      <w:r>
+        <w:rPr>
+          <w:rFonts w:cs="Arial"/>
+        </w:rPr>
+        <w:t>FlashRank</w:t>
+      </w:r>
+      <w:proofErr w:type="spellEnd"/>
+      <w:r>
+        <w:rPr>
+          <w:rFonts w:cs="Arial"/>
+        </w:rPr>
+        <w:t xml:space="preserve"> tackles the public side of this problem. It lets users inspect what Apple publicly returns for keyword searches, track where their app appears, compare competitor positions, and build better keyword lists from observable ranking behavior.</w:t>
       </w:r>
     </w:p>
     <w:p>
@@ -4768,7 +4873,21 @@
           <w:rFonts w:ascii="Arial" w:hAnsi="Arial" w:cs="Arial"/>
         </w:rPr>
         <w:lastRenderedPageBreak/>
-        <w:t>TLDR: What FlashRank Offers</w:t>
+        <w:t xml:space="preserve">TLDR: What </w:t>
+      </w:r>
+      <w:proofErr w:type="spellStart"/>
+      <w:r>
+        <w:rPr>
+          <w:rFonts w:ascii="Arial" w:hAnsi="Arial" w:cs="Arial"/>
+        </w:rPr>
+        <w:t>FlashRank</w:t>
+      </w:r>
+      <w:proofErr w:type="spellEnd"/>
+      <w:r>
+        <w:rPr>
+          <w:rFonts w:ascii="Arial" w:hAnsi="Arial" w:cs="Arial"/>
+        </w:rPr>
+        <w:t xml:space="preserve"> Offers</w:t>
       </w:r>
       <w:bookmarkEnd w:id="3"/>
     </w:p>
@@ -5354,7 +5473,25 @@
                 <w:color w:val="111827"/>
                 <w:sz w:val="19"/>
               </w:rPr>
-              <w:t>Prepare for App Store Connect, Apple Search Ads, DeepL, and future paid integrations without exposing private keys in frontend code.</w:t>
+              <w:t xml:space="preserve">Prepare for App Store Connect, Apple Search Ads, </w:t>
+            </w:r>
+            <w:proofErr w:type="spellStart"/>
+            <w:r>
+              <w:rPr>
+                <w:rFonts w:cs="Arial"/>
+                <w:color w:val="111827"/>
+                <w:sz w:val="19"/>
+              </w:rPr>
+              <w:t>DeepL</w:t>
+            </w:r>
+            <w:proofErr w:type="spellEnd"/>
+            <w:r>
+              <w:rPr>
+                <w:rFonts w:cs="Arial"/>
+                <w:color w:val="111827"/>
+                <w:sz w:val="19"/>
+              </w:rPr>
+              <w:t>, and future paid integrations without exposing private keys in frontend code.</w:t>
             </w:r>
           </w:p>
         </w:tc>
@@ -5671,6 +5808,7 @@
                 <w:rFonts w:cs="Arial"/>
               </w:rPr>
             </w:pPr>
+            <w:proofErr w:type="spellStart"/>
             <w:r>
               <w:rPr>
                 <w:rFonts w:cs="Arial"/>
@@ -5679,6 +5817,7 @@
               </w:rPr>
               <w:t>Zustand</w:t>
             </w:r>
+            <w:proofErr w:type="spellEnd"/>
           </w:p>
         </w:tc>
         <w:tc>
@@ -6072,7 +6211,25 @@
                 <w:color w:val="111827"/>
                 <w:sz w:val="19"/>
               </w:rPr>
-              <w:t>Prepares server-side key handling for Apple, DeepL, and future billing integrations.</w:t>
+              <w:t xml:space="preserve">Prepares server-side key handling for Apple, </w:t>
+            </w:r>
+            <w:proofErr w:type="spellStart"/>
+            <w:r>
+              <w:rPr>
+                <w:rFonts w:cs="Arial"/>
+                <w:color w:val="111827"/>
+                <w:sz w:val="19"/>
+              </w:rPr>
+              <w:t>DeepL</w:t>
+            </w:r>
+            <w:proofErr w:type="spellEnd"/>
+            <w:r>
+              <w:rPr>
+                <w:rFonts w:cs="Arial"/>
+                <w:color w:val="111827"/>
+                <w:sz w:val="19"/>
+              </w:rPr>
+              <w:t>, and future billing integrations.</w:t>
             </w:r>
           </w:p>
         </w:tc>
@@ -6484,7 +6641,25 @@
                 <w:color w:val="111827"/>
                 <w:sz w:val="19"/>
               </w:rPr>
-              <w:t>Use DeepL to translate foreign-language keywords and reviews.</w:t>
+              <w:t xml:space="preserve">Use </w:t>
+            </w:r>
+            <w:proofErr w:type="spellStart"/>
+            <w:r>
+              <w:rPr>
+                <w:rFonts w:cs="Arial"/>
+                <w:color w:val="111827"/>
+                <w:sz w:val="19"/>
+              </w:rPr>
+              <w:t>DeepL</w:t>
+            </w:r>
+            <w:proofErr w:type="spellEnd"/>
+            <w:r>
+              <w:rPr>
+                <w:rFonts w:cs="Arial"/>
+                <w:color w:val="111827"/>
+                <w:sz w:val="19"/>
+              </w:rPr>
+              <w:t xml:space="preserve"> to translate foreign-language keywords and reviews.</w:t>
             </w:r>
           </w:p>
         </w:tc>
@@ -6865,7 +7040,21 @@
         <w:rPr>
           <w:rFonts w:cs="Arial"/>
         </w:rPr>
-        <w:t>The core concepts in FlashRank are:</w:t>
+        <w:t xml:space="preserve">The core concepts in </w:t>
+      </w:r>
+      <w:proofErr w:type="spellStart"/>
+      <w:r>
+        <w:rPr>
+          <w:rFonts w:cs="Arial"/>
+        </w:rPr>
+        <w:t>FlashRank</w:t>
+      </w:r>
+      <w:proofErr w:type="spellEnd"/>
+      <w:r>
+        <w:rPr>
+          <w:rFonts w:cs="Arial"/>
+        </w:rPr>
+        <w:t xml:space="preserve"> are:</w:t>
       </w:r>
     </w:p>
     <w:tbl>
@@ -7428,11 +7617,19 @@
           <w:rFonts w:cs="Arial"/>
         </w:rPr>
       </w:pPr>
-      <w:r>
-        <w:rPr>
-          <w:rFonts w:cs="Arial"/>
-        </w:rPr>
-        <w:t>FlashRank was built around six product goals:</w:t>
+      <w:proofErr w:type="spellStart"/>
+      <w:r>
+        <w:rPr>
+          <w:rFonts w:cs="Arial"/>
+        </w:rPr>
+        <w:t>FlashRank</w:t>
+      </w:r>
+      <w:proofErr w:type="spellEnd"/>
+      <w:r>
+        <w:rPr>
+          <w:rFonts w:cs="Arial"/>
+        </w:rPr>
+        <w:t xml:space="preserve"> was built around six product goals:</w:t>
       </w:r>
     </w:p>
     <w:p>
@@ -7541,7 +7738,21 @@
         <w:rPr>
           <w:rFonts w:cs="Arial"/>
         </w:rPr>
-        <w:t>The app is intentionally closer to a professional ASO dashboard than a marketing landing page. ASO workflows involve repeated scanning, sorting, filtering, and comparison. Because of that, FlashRank uses tables, sidebars, modals, chips, charts, and status labels rather than oversized promotional sections.</w:t>
+        <w:t xml:space="preserve">The app is intentionally closer to a professional ASO dashboard than a marketing landing page. ASO workflows involve repeated scanning, sorting, filtering, and comparison. Because of that, </w:t>
+      </w:r>
+      <w:proofErr w:type="spellStart"/>
+      <w:r>
+        <w:rPr>
+          <w:rFonts w:cs="Arial"/>
+        </w:rPr>
+        <w:t>FlashRank</w:t>
+      </w:r>
+      <w:proofErr w:type="spellEnd"/>
+      <w:r>
+        <w:rPr>
+          <w:rFonts w:cs="Arial"/>
+        </w:rPr>
+        <w:t xml:space="preserve"> uses tables, sidebars, modals, chips, charts, and status labels rather than oversized promotional sections.</w:t>
       </w:r>
     </w:p>
     <w:p>
@@ -7581,6 +7792,7 @@
           <w:rFonts w:cs="Arial"/>
         </w:rPr>
       </w:pPr>
+      <w:proofErr w:type="spellStart"/>
       <w:r>
         <w:rPr>
           <w:rFonts w:cs="Arial"/>
@@ -7588,7 +7800,17 @@
           <w:color w:val="4B5563"/>
           <w:sz w:val="18"/>
         </w:rPr>
-        <w:t>FlashRank overview dashboard</w:t>
+        <w:t>FlashRank</w:t>
+      </w:r>
+      <w:proofErr w:type="spellEnd"/>
+      <w:r>
+        <w:rPr>
+          <w:rFonts w:cs="Arial"/>
+          <w:i/>
+          <w:color w:val="4B5563"/>
+          <w:sz w:val="18"/>
+        </w:rPr>
+        <w:t xml:space="preserve"> overview dashboard</w:t>
       </w:r>
     </w:p>
     <w:p>
@@ -7693,7 +7915,21 @@
         <w:rPr>
           <w:rFonts w:cs="Arial"/>
         </w:rPr>
-        <w:t>Users can search for an App Store app by name or paste an App Store URL. FlashRank uses the public Apple iTunes Search and Lookup endpoints through local API routes to find app metadata such as:</w:t>
+        <w:t xml:space="preserve">Users can search for an App Store app by name or paste an App Store URL. </w:t>
+      </w:r>
+      <w:proofErr w:type="spellStart"/>
+      <w:r>
+        <w:rPr>
+          <w:rFonts w:cs="Arial"/>
+        </w:rPr>
+        <w:t>FlashRank</w:t>
+      </w:r>
+      <w:proofErr w:type="spellEnd"/>
+      <w:r>
+        <w:rPr>
+          <w:rFonts w:cs="Arial"/>
+        </w:rPr>
+        <w:t xml:space="preserve"> uses the public Apple iTunes Search and Lookup endpoints through local API routes to find app metadata such as:</w:t>
       </w:r>
     </w:p>
     <w:p>
@@ -7834,7 +8070,21 @@
         <w:rPr>
           <w:rFonts w:cs="Arial"/>
         </w:rPr>
-        <w:t>Once an app is added, FlashRank can hydrate starter keyword ideas from the app name, category, metadata, and public App Store search behavior.</w:t>
+        <w:t xml:space="preserve">Once an app is added, </w:t>
+      </w:r>
+      <w:proofErr w:type="spellStart"/>
+      <w:r>
+        <w:rPr>
+          <w:rFonts w:cs="Arial"/>
+        </w:rPr>
+        <w:t>FlashRank</w:t>
+      </w:r>
+      <w:proofErr w:type="spellEnd"/>
+      <w:r>
+        <w:rPr>
+          <w:rFonts w:cs="Arial"/>
+        </w:rPr>
+        <w:t xml:space="preserve"> can hydrate starter keyword ideas from the app name, category, metadata, and public App Store search behavior.</w:t>
       </w:r>
     </w:p>
     <w:p>
@@ -8203,6 +8453,7 @@
           <w:rFonts w:cs="Arial"/>
         </w:rPr>
       </w:pPr>
+      <w:proofErr w:type="spellStart"/>
       <w:r>
         <w:rPr>
           <w:rFonts w:cs="Arial"/>
@@ -8210,7 +8461,17 @@
           <w:color w:val="4B5563"/>
           <w:sz w:val="18"/>
         </w:rPr>
-        <w:t>FlashRank keyword-only research table</w:t>
+        <w:t>FlashRank</w:t>
+      </w:r>
+      <w:proofErr w:type="spellEnd"/>
+      <w:r>
+        <w:rPr>
+          <w:rFonts w:cs="Arial"/>
+          <w:i/>
+          <w:color w:val="4B5563"/>
+          <w:sz w:val="18"/>
+        </w:rPr>
+        <w:t xml:space="preserve"> keyword-only research table</w:t>
       </w:r>
     </w:p>
     <w:p>
@@ -8303,11 +8564,19 @@
           <w:rFonts w:cs="Arial"/>
         </w:rPr>
       </w:pPr>
-      <w:r>
-        <w:rPr>
-          <w:rFonts w:cs="Arial"/>
-        </w:rPr>
-        <w:t>FlashRank generates keyword suggestions from several sources:</w:t>
+      <w:proofErr w:type="spellStart"/>
+      <w:r>
+        <w:rPr>
+          <w:rFonts w:cs="Arial"/>
+        </w:rPr>
+        <w:t>FlashRank</w:t>
+      </w:r>
+      <w:proofErr w:type="spellEnd"/>
+      <w:r>
+        <w:rPr>
+          <w:rFonts w:cs="Arial"/>
+        </w:rPr>
+        <w:t xml:space="preserve"> generates keyword suggestions from several sources:</w:t>
       </w:r>
     </w:p>
     <w:p>
@@ -8565,20 +8834,48 @@
         <w:rPr>
           <w:rFonts w:cs="Arial"/>
         </w:rPr>
-        <w:t>Users can add competitor apps and compare rankings side by side. FlashRank does not claim to extract a magical private list of every keyword a competitor ranks for, because Apple does not provide such a public endpoint.</w:t>
-      </w:r>
-    </w:p>
-    <w:p>
-      <w:pPr>
-        <w:rPr>
-          <w:rFonts w:cs="Arial"/>
-        </w:rPr>
-      </w:pPr>
-      <w:r>
-        <w:rPr>
-          <w:rFonts w:cs="Arial"/>
-        </w:rPr>
-        <w:t>Instead, FlashRank uses a public-search strategy:</w:t>
+        <w:t xml:space="preserve">Users can add competitor apps and compare rankings side by side. </w:t>
+      </w:r>
+      <w:proofErr w:type="spellStart"/>
+      <w:r>
+        <w:rPr>
+          <w:rFonts w:cs="Arial"/>
+        </w:rPr>
+        <w:t>FlashRank</w:t>
+      </w:r>
+      <w:proofErr w:type="spellEnd"/>
+      <w:r>
+        <w:rPr>
+          <w:rFonts w:cs="Arial"/>
+        </w:rPr>
+        <w:t xml:space="preserve"> does not claim to extract a magical private list of every keyword a competitor ranks for, because Apple does not provide such a public endpoint.</w:t>
+      </w:r>
+    </w:p>
+    <w:p>
+      <w:pPr>
+        <w:rPr>
+          <w:rFonts w:cs="Arial"/>
+        </w:rPr>
+      </w:pPr>
+      <w:r>
+        <w:rPr>
+          <w:rFonts w:cs="Arial"/>
+        </w:rPr>
+        <w:t xml:space="preserve">Instead, </w:t>
+      </w:r>
+      <w:proofErr w:type="spellStart"/>
+      <w:r>
+        <w:rPr>
+          <w:rFonts w:cs="Arial"/>
+        </w:rPr>
+        <w:t>FlashRank</w:t>
+      </w:r>
+      <w:proofErr w:type="spellEnd"/>
+      <w:r>
+        <w:rPr>
+          <w:rFonts w:cs="Arial"/>
+        </w:rPr>
+        <w:t xml:space="preserve"> uses a public-search strategy:</w:t>
       </w:r>
     </w:p>
     <w:p>
@@ -8791,11 +9088,19 @@
           <w:rFonts w:cs="Arial"/>
         </w:rPr>
       </w:pPr>
-      <w:r>
-        <w:rPr>
-          <w:rFonts w:cs="Arial"/>
-        </w:rPr>
-        <w:t>FlashRank includes a Ratings &amp; Reviews view that aggregates public storefront rating data and public review feeds where available. This gives users a lightweight view of app reputation across countries.</w:t>
+      <w:proofErr w:type="spellStart"/>
+      <w:r>
+        <w:rPr>
+          <w:rFonts w:cs="Arial"/>
+        </w:rPr>
+        <w:t>FlashRank</w:t>
+      </w:r>
+      <w:proofErr w:type="spellEnd"/>
+      <w:r>
+        <w:rPr>
+          <w:rFonts w:cs="Arial"/>
+        </w:rPr>
+        <w:t xml:space="preserve"> includes a Ratings &amp; Reviews view that aggregates public storefront rating data and public review feeds where available. This gives users a lightweight view of app reputation across countries.</w:t>
       </w:r>
     </w:p>
     <w:p>
@@ -8895,6 +9200,7 @@
           <w:rFonts w:cs="Arial"/>
         </w:rPr>
       </w:pPr>
+      <w:proofErr w:type="spellStart"/>
       <w:r>
         <w:rPr>
           <w:rFonts w:cs="Arial"/>
@@ -8902,7 +9208,17 @@
           <w:color w:val="4B5563"/>
           <w:sz w:val="18"/>
         </w:rPr>
-        <w:t>FlashRank Ratings and Reviews view</w:t>
+        <w:t>FlashRank</w:t>
+      </w:r>
+      <w:proofErr w:type="spellEnd"/>
+      <w:r>
+        <w:rPr>
+          <w:rFonts w:cs="Arial"/>
+          <w:i/>
+          <w:color w:val="4B5563"/>
+          <w:sz w:val="18"/>
+        </w:rPr>
+        <w:t xml:space="preserve"> Ratings and Reviews view</w:t>
       </w:r>
     </w:p>
     <w:p>
@@ -9008,11 +9324,19 @@
           <w:rFonts w:cs="Arial"/>
         </w:rPr>
       </w:pPr>
-      <w:r>
-        <w:rPr>
-          <w:rFonts w:cs="Arial"/>
-        </w:rPr>
-        <w:t>FlashRank stores keywords with region awareness so users can switch regions without destroying their keyword set. This matters because ASO is not global by default. Every country can have different competitors, language patterns, search behavior, and ranking outcomes.</w:t>
+      <w:proofErr w:type="spellStart"/>
+      <w:r>
+        <w:rPr>
+          <w:rFonts w:cs="Arial"/>
+        </w:rPr>
+        <w:t>FlashRank</w:t>
+      </w:r>
+      <w:proofErr w:type="spellEnd"/>
+      <w:r>
+        <w:rPr>
+          <w:rFonts w:cs="Arial"/>
+        </w:rPr>
+        <w:t xml:space="preserve"> stores keywords with region awareness so users can switch regions without destroying their keyword set. This matters because ASO is not global by default. Every country can have different competitors, language patterns, search behavior, and ranking outcomes.</w:t>
       </w:r>
     </w:p>
     <w:p>
@@ -9037,24 +9361,46 @@
           <w:rFonts w:cs="Arial"/>
         </w:rPr>
       </w:pPr>
-      <w:r>
-        <w:rPr>
-          <w:rFonts w:cs="Arial"/>
-        </w:rPr>
-        <w:t>FlashRank also supports keyword research without selecting an app. In that mode, users can inspect keyword popularity, difficulty, and public ranking apps even before tracking a specific app.</w:t>
-      </w:r>
-    </w:p>
-    <w:p>
-      <w:pPr>
-        <w:rPr>
-          <w:rFonts w:cs="Arial"/>
-        </w:rPr>
-      </w:pPr>
-      <w:r>
-        <w:rPr>
-          <w:rFonts w:cs="Arial"/>
-        </w:rPr>
-        <w:t>When no app is selected, the position column cannot show an app rank. Instead, FlashRank displays a clear no-app status rather than leaving the user guessing.</w:t>
+      <w:proofErr w:type="spellStart"/>
+      <w:r>
+        <w:rPr>
+          <w:rFonts w:cs="Arial"/>
+        </w:rPr>
+        <w:t>FlashRank</w:t>
+      </w:r>
+      <w:proofErr w:type="spellEnd"/>
+      <w:r>
+        <w:rPr>
+          <w:rFonts w:cs="Arial"/>
+        </w:rPr>
+        <w:t xml:space="preserve"> also supports keyword research without selecting an app. In that mode, users can inspect keyword popularity, difficulty, and public ranking apps even before tracking a specific app.</w:t>
+      </w:r>
+    </w:p>
+    <w:p>
+      <w:pPr>
+        <w:rPr>
+          <w:rFonts w:cs="Arial"/>
+        </w:rPr>
+      </w:pPr>
+      <w:r>
+        <w:rPr>
+          <w:rFonts w:cs="Arial"/>
+        </w:rPr>
+        <w:t xml:space="preserve">When no app is selected, the position column cannot show an app rank. Instead, </w:t>
+      </w:r>
+      <w:proofErr w:type="spellStart"/>
+      <w:r>
+        <w:rPr>
+          <w:rFonts w:cs="Arial"/>
+        </w:rPr>
+        <w:t>FlashRank</w:t>
+      </w:r>
+      <w:proofErr w:type="spellEnd"/>
+      <w:r>
+        <w:rPr>
+          <w:rFonts w:cs="Arial"/>
+        </w:rPr>
+        <w:t xml:space="preserve"> displays a clear no-app status rather than leaving the user guessing.</w:t>
       </w:r>
     </w:p>
     <w:p>
@@ -9126,12 +9472,21 @@
           <w:rFonts w:cs="Arial"/>
         </w:rPr>
       </w:pPr>
+      <w:proofErr w:type="spellStart"/>
       <w:r>
         <w:rPr>
           <w:rFonts w:cs="Arial"/>
           <w:sz w:val="20"/>
         </w:rPr>
-        <w:t>DeepL translation</w:t>
+        <w:t>DeepL</w:t>
+      </w:r>
+      <w:proofErr w:type="spellEnd"/>
+      <w:r>
+        <w:rPr>
+          <w:rFonts w:cs="Arial"/>
+          <w:sz w:val="20"/>
+        </w:rPr>
+        <w:t xml:space="preserve"> translation</w:t>
       </w:r>
     </w:p>
     <w:p>
@@ -9199,11 +9554,33 @@
           <w:rFonts w:cs="Arial"/>
         </w:rPr>
       </w:pPr>
-      <w:r>
-        <w:rPr>
-          <w:rFonts w:cs="Arial"/>
-        </w:rPr>
-        <w:t>FlashRank is organized as a Next.js application with client-side UI components, a Zustand store, typed domain models, and API routes that proxy external data sources.</w:t>
+      <w:proofErr w:type="spellStart"/>
+      <w:r>
+        <w:rPr>
+          <w:rFonts w:cs="Arial"/>
+        </w:rPr>
+        <w:t>FlashRank</w:t>
+      </w:r>
+      <w:proofErr w:type="spellEnd"/>
+      <w:r>
+        <w:rPr>
+          <w:rFonts w:cs="Arial"/>
+        </w:rPr>
+        <w:t xml:space="preserve"> is organized as a Next.js application with client-side UI components, a </w:t>
+      </w:r>
+      <w:proofErr w:type="spellStart"/>
+      <w:r>
+        <w:rPr>
+          <w:rFonts w:cs="Arial"/>
+        </w:rPr>
+        <w:t>Zustand</w:t>
+      </w:r>
+      <w:proofErr w:type="spellEnd"/>
+      <w:r>
+        <w:rPr>
+          <w:rFonts w:cs="Arial"/>
+        </w:rPr>
+        <w:t xml:space="preserve"> store, typed domain models, and API routes that proxy external data sources.</w:t>
       </w:r>
       <w:r>
         <w:rPr>
@@ -9381,6 +9758,7 @@
                 <w:rFonts w:cs="Arial"/>
               </w:rPr>
             </w:pPr>
+            <w:proofErr w:type="spellStart"/>
             <w:r>
               <w:rPr>
                 <w:rFonts w:cs="Arial"/>
@@ -9389,6 +9767,7 @@
               </w:rPr>
               <w:t>Sidebar.tsx</w:t>
             </w:r>
+            <w:proofErr w:type="spellEnd"/>
           </w:p>
         </w:tc>
         <w:tc>
@@ -9442,6 +9821,7 @@
                 <w:rFonts w:cs="Arial"/>
               </w:rPr>
             </w:pPr>
+            <w:proofErr w:type="spellStart"/>
             <w:r>
               <w:rPr>
                 <w:rFonts w:cs="Arial"/>
@@ -9450,6 +9830,7 @@
               </w:rPr>
               <w:t>HeaderBar.tsx</w:t>
             </w:r>
+            <w:proofErr w:type="spellEnd"/>
           </w:p>
         </w:tc>
         <w:tc>
@@ -9503,6 +9884,7 @@
                 <w:rFonts w:cs="Arial"/>
               </w:rPr>
             </w:pPr>
+            <w:proofErr w:type="spellStart"/>
             <w:r>
               <w:rPr>
                 <w:rFonts w:cs="Arial"/>
@@ -9511,6 +9893,7 @@
               </w:rPr>
               <w:t>KeywordTable.tsx</w:t>
             </w:r>
+            <w:proofErr w:type="spellEnd"/>
           </w:p>
         </w:tc>
         <w:tc>
@@ -9564,6 +9947,7 @@
                 <w:rFonts w:cs="Arial"/>
               </w:rPr>
             </w:pPr>
+            <w:proofErr w:type="spellStart"/>
             <w:r>
               <w:rPr>
                 <w:rFonts w:cs="Arial"/>
@@ -9572,6 +9956,7 @@
               </w:rPr>
               <w:t>AddAppModal.tsx</w:t>
             </w:r>
+            <w:proofErr w:type="spellEnd"/>
           </w:p>
         </w:tc>
         <w:tc>
@@ -9625,6 +10010,7 @@
                 <w:rFonts w:cs="Arial"/>
               </w:rPr>
             </w:pPr>
+            <w:proofErr w:type="spellStart"/>
             <w:r>
               <w:rPr>
                 <w:rFonts w:cs="Arial"/>
@@ -9633,6 +10019,7 @@
               </w:rPr>
               <w:t>AddKeywordModal.tsx</w:t>
             </w:r>
+            <w:proofErr w:type="spellEnd"/>
           </w:p>
         </w:tc>
         <w:tc>
@@ -9686,6 +10073,7 @@
                 <w:rFonts w:cs="Arial"/>
               </w:rPr>
             </w:pPr>
+            <w:proofErr w:type="spellStart"/>
             <w:r>
               <w:rPr>
                 <w:rFonts w:cs="Arial"/>
@@ -9694,6 +10082,7 @@
               </w:rPr>
               <w:t>KeywordResearchModal.tsx</w:t>
             </w:r>
+            <w:proofErr w:type="spellEnd"/>
           </w:p>
         </w:tc>
         <w:tc>
@@ -9747,6 +10136,7 @@
                 <w:rFonts w:cs="Arial"/>
               </w:rPr>
             </w:pPr>
+            <w:proofErr w:type="spellStart"/>
             <w:r>
               <w:rPr>
                 <w:rFonts w:cs="Arial"/>
@@ -9755,6 +10145,7 @@
               </w:rPr>
               <w:t>CompetitorsView.tsx</w:t>
             </w:r>
+            <w:proofErr w:type="spellEnd"/>
           </w:p>
         </w:tc>
         <w:tc>
@@ -9808,6 +10199,7 @@
                 <w:rFonts w:cs="Arial"/>
               </w:rPr>
             </w:pPr>
+            <w:proofErr w:type="spellStart"/>
             <w:r>
               <w:rPr>
                 <w:rFonts w:cs="Arial"/>
@@ -9816,6 +10208,7 @@
               </w:rPr>
               <w:t>RatingsReviewsView.tsx</w:t>
             </w:r>
+            <w:proofErr w:type="spellEnd"/>
           </w:p>
         </w:tc>
         <w:tc>
@@ -9869,6 +10262,7 @@
                 <w:rFonts w:cs="Arial"/>
               </w:rPr>
             </w:pPr>
+            <w:proofErr w:type="spellStart"/>
             <w:r>
               <w:rPr>
                 <w:rFonts w:cs="Arial"/>
@@ -9877,6 +10271,7 @@
               </w:rPr>
               <w:t>DetailPanel.tsx</w:t>
             </w:r>
+            <w:proofErr w:type="spellEnd"/>
           </w:p>
         </w:tc>
         <w:tc>
@@ -9952,11 +10347,47 @@
           <w:rFonts w:cs="Arial"/>
         </w:rPr>
       </w:pPr>
-      <w:r>
-        <w:rPr>
-          <w:rFonts w:cs="Arial"/>
-        </w:rPr>
-        <w:t>FlashRank uses Zustand for app state. Zustand was chosen over Redux because the project needed a fast, understandable, local-first state model without excessive boilerplate.</w:t>
+      <w:proofErr w:type="spellStart"/>
+      <w:r>
+        <w:rPr>
+          <w:rFonts w:cs="Arial"/>
+        </w:rPr>
+        <w:t>FlashRank</w:t>
+      </w:r>
+      <w:proofErr w:type="spellEnd"/>
+      <w:r>
+        <w:rPr>
+          <w:rFonts w:cs="Arial"/>
+        </w:rPr>
+        <w:t xml:space="preserve"> uses </w:t>
+      </w:r>
+      <w:proofErr w:type="spellStart"/>
+      <w:r>
+        <w:rPr>
+          <w:rFonts w:cs="Arial"/>
+        </w:rPr>
+        <w:t>Zustand</w:t>
+      </w:r>
+      <w:proofErr w:type="spellEnd"/>
+      <w:r>
+        <w:rPr>
+          <w:rFonts w:cs="Arial"/>
+        </w:rPr>
+        <w:t xml:space="preserve"> for app state. </w:t>
+      </w:r>
+      <w:proofErr w:type="spellStart"/>
+      <w:r>
+        <w:rPr>
+          <w:rFonts w:cs="Arial"/>
+        </w:rPr>
+        <w:t>Zustand</w:t>
+      </w:r>
+      <w:proofErr w:type="spellEnd"/>
+      <w:r>
+        <w:rPr>
+          <w:rFonts w:cs="Arial"/>
+        </w:rPr>
+        <w:t xml:space="preserve"> was chosen over Redux because the project needed a fast, understandable, local-first state model without excessive boilerplate.</w:t>
       </w:r>
     </w:p>
     <w:p>
@@ -10171,7 +10602,35 @@
         <w:rPr>
           <w:rFonts w:cs="Arial"/>
         </w:rPr>
-        <w:t>The core domain types live in src/types/index.ts. Important models include:</w:t>
+        <w:t xml:space="preserve">The core domain types live in </w:t>
+      </w:r>
+      <w:proofErr w:type="spellStart"/>
+      <w:r>
+        <w:rPr>
+          <w:rFonts w:cs="Arial"/>
+        </w:rPr>
+        <w:t>src</w:t>
+      </w:r>
+      <w:proofErr w:type="spellEnd"/>
+      <w:r>
+        <w:rPr>
+          <w:rFonts w:cs="Arial"/>
+        </w:rPr>
+        <w:t>/types/</w:t>
+      </w:r>
+      <w:proofErr w:type="spellStart"/>
+      <w:r>
+        <w:rPr>
+          <w:rFonts w:cs="Arial"/>
+        </w:rPr>
+        <w:t>index.ts</w:t>
+      </w:r>
+      <w:proofErr w:type="spellEnd"/>
+      <w:r>
+        <w:rPr>
+          <w:rFonts w:cs="Arial"/>
+        </w:rPr>
+        <w:t>. Important models include:</w:t>
       </w:r>
     </w:p>
     <w:p>
@@ -10182,6 +10641,7 @@
           <w:rFonts w:cs="Arial"/>
         </w:rPr>
       </w:pPr>
+      <w:proofErr w:type="spellStart"/>
       <w:r>
         <w:rPr>
           <w:rFonts w:cs="Arial"/>
@@ -10189,6 +10649,7 @@
         </w:rPr>
         <w:t>AppMetadata</w:t>
       </w:r>
+      <w:proofErr w:type="spellEnd"/>
     </w:p>
     <w:p>
       <w:pPr>
@@ -10198,6 +10659,7 @@
           <w:rFonts w:cs="Arial"/>
         </w:rPr>
       </w:pPr>
+      <w:proofErr w:type="spellStart"/>
       <w:r>
         <w:rPr>
           <w:rFonts w:cs="Arial"/>
@@ -10205,6 +10667,7 @@
         </w:rPr>
         <w:t>TrackedApp</w:t>
       </w:r>
+      <w:proofErr w:type="spellEnd"/>
     </w:p>
     <w:p>
       <w:pPr>
@@ -10214,6 +10677,7 @@
           <w:rFonts w:cs="Arial"/>
         </w:rPr>
       </w:pPr>
+      <w:proofErr w:type="spellStart"/>
       <w:r>
         <w:rPr>
           <w:rFonts w:cs="Arial"/>
@@ -10221,6 +10685,7 @@
         </w:rPr>
         <w:t>TrackedKeyword</w:t>
       </w:r>
+      <w:proofErr w:type="spellEnd"/>
     </w:p>
     <w:p>
       <w:pPr>
@@ -10230,6 +10695,7 @@
           <w:rFonts w:cs="Arial"/>
         </w:rPr>
       </w:pPr>
+      <w:proofErr w:type="spellStart"/>
       <w:r>
         <w:rPr>
           <w:rFonts w:cs="Arial"/>
@@ -10237,6 +10703,7 @@
         </w:rPr>
         <w:t>RankingAppSnapshot</w:t>
       </w:r>
+      <w:proofErr w:type="spellEnd"/>
     </w:p>
     <w:p>
       <w:pPr>
@@ -10246,6 +10713,7 @@
           <w:rFonts w:cs="Arial"/>
         </w:rPr>
       </w:pPr>
+      <w:proofErr w:type="spellStart"/>
       <w:r>
         <w:rPr>
           <w:rFonts w:cs="Arial"/>
@@ -10253,6 +10721,7 @@
         </w:rPr>
         <w:t>RankHistoryEntry</w:t>
       </w:r>
+      <w:proofErr w:type="spellEnd"/>
     </w:p>
     <w:p>
       <w:pPr>
@@ -10262,6 +10731,7 @@
           <w:rFonts w:cs="Arial"/>
         </w:rPr>
       </w:pPr>
+      <w:proofErr w:type="spellStart"/>
       <w:r>
         <w:rPr>
           <w:rFonts w:cs="Arial"/>
@@ -10269,6 +10739,7 @@
         </w:rPr>
         <w:t>KeywordTag</w:t>
       </w:r>
+      <w:proofErr w:type="spellEnd"/>
     </w:p>
     <w:p>
       <w:pPr>
@@ -10278,6 +10749,7 @@
           <w:rFonts w:cs="Arial"/>
         </w:rPr>
       </w:pPr>
+      <w:proofErr w:type="spellStart"/>
       <w:r>
         <w:rPr>
           <w:rFonts w:cs="Arial"/>
@@ -10285,6 +10757,7 @@
         </w:rPr>
         <w:t>RankStatus</w:t>
       </w:r>
+      <w:proofErr w:type="spellEnd"/>
     </w:p>
     <w:p>
       <w:pPr>
@@ -10294,6 +10767,7 @@
           <w:rFonts w:cs="Arial"/>
         </w:rPr>
       </w:pPr>
+      <w:proofErr w:type="spellStart"/>
       <w:r>
         <w:rPr>
           <w:rFonts w:cs="Arial"/>
@@ -10301,18 +10775,33 @@
         </w:rPr>
         <w:t>ASODataSource</w:t>
       </w:r>
-    </w:p>
-    <w:p>
-      <w:pPr>
-        <w:rPr>
-          <w:rFonts w:cs="Arial"/>
-        </w:rPr>
-      </w:pPr>
-      <w:r>
-        <w:rPr>
-          <w:rFonts w:cs="Arial"/>
-        </w:rPr>
-        <w:t>The data model explicitly tracks data sources such as estimated, itunes-search, apple-search-ads, and app-store-connect. That is important because it lets the UI distinguish between estimated values and API-backed values.</w:t>
+      <w:proofErr w:type="spellEnd"/>
+    </w:p>
+    <w:p>
+      <w:pPr>
+        <w:rPr>
+          <w:rFonts w:cs="Arial"/>
+        </w:rPr>
+      </w:pPr>
+      <w:r>
+        <w:rPr>
+          <w:rFonts w:cs="Arial"/>
+        </w:rPr>
+        <w:t xml:space="preserve">The data model explicitly tracks data sources such as estimated, </w:t>
+      </w:r>
+      <w:proofErr w:type="spellStart"/>
+      <w:r>
+        <w:rPr>
+          <w:rFonts w:cs="Arial"/>
+        </w:rPr>
+        <w:t>itunes</w:t>
+      </w:r>
+      <w:proofErr w:type="spellEnd"/>
+      <w:r>
+        <w:rPr>
+          <w:rFonts w:cs="Arial"/>
+        </w:rPr>
+        <w:t>-search, apple-search-ads, and app-store-connect. That is important because it lets the UI distinguish between estimated values and API-backed values.</w:t>
       </w:r>
     </w:p>
     <w:p>
@@ -10337,11 +10826,19 @@
           <w:rFonts w:cs="Arial"/>
         </w:rPr>
       </w:pPr>
-      <w:r>
-        <w:rPr>
-          <w:rFonts w:cs="Arial"/>
-        </w:rPr>
-        <w:t>FlashRank uses Next.js API routes as a proxy layer between the browser and external services.</w:t>
+      <w:proofErr w:type="spellStart"/>
+      <w:r>
+        <w:rPr>
+          <w:rFonts w:cs="Arial"/>
+        </w:rPr>
+        <w:t>FlashRank</w:t>
+      </w:r>
+      <w:proofErr w:type="spellEnd"/>
+      <w:r>
+        <w:rPr>
+          <w:rFonts w:cs="Arial"/>
+        </w:rPr>
+        <w:t xml:space="preserve"> uses Next.js API routes as a proxy layer between the browser and external services.</w:t>
       </w:r>
     </w:p>
     <w:tbl>
@@ -10455,7 +10952,25 @@
                 <w:color w:val="111827"/>
                 <w:sz w:val="19"/>
               </w:rPr>
-              <w:t>/api/search</w:t>
+              <w:t>/</w:t>
+            </w:r>
+            <w:proofErr w:type="spellStart"/>
+            <w:r>
+              <w:rPr>
+                <w:rFonts w:cs="Arial"/>
+                <w:color w:val="111827"/>
+                <w:sz w:val="19"/>
+              </w:rPr>
+              <w:t>api</w:t>
+            </w:r>
+            <w:proofErr w:type="spellEnd"/>
+            <w:r>
+              <w:rPr>
+                <w:rFonts w:cs="Arial"/>
+                <w:color w:val="111827"/>
+                <w:sz w:val="19"/>
+              </w:rPr>
+              <w:t>/search</w:t>
             </w:r>
           </w:p>
         </w:tc>
@@ -10516,7 +11031,25 @@
                 <w:color w:val="111827"/>
                 <w:sz w:val="19"/>
               </w:rPr>
-              <w:t>/api/lookup</w:t>
+              <w:t>/</w:t>
+            </w:r>
+            <w:proofErr w:type="spellStart"/>
+            <w:r>
+              <w:rPr>
+                <w:rFonts w:cs="Arial"/>
+                <w:color w:val="111827"/>
+                <w:sz w:val="19"/>
+              </w:rPr>
+              <w:t>api</w:t>
+            </w:r>
+            <w:proofErr w:type="spellEnd"/>
+            <w:r>
+              <w:rPr>
+                <w:rFonts w:cs="Arial"/>
+                <w:color w:val="111827"/>
+                <w:sz w:val="19"/>
+              </w:rPr>
+              <w:t>/lookup</w:t>
             </w:r>
           </w:p>
         </w:tc>
@@ -10577,7 +11110,25 @@
                 <w:color w:val="111827"/>
                 <w:sz w:val="19"/>
               </w:rPr>
-              <w:t>/api/suggestions</w:t>
+              <w:t>/</w:t>
+            </w:r>
+            <w:proofErr w:type="spellStart"/>
+            <w:r>
+              <w:rPr>
+                <w:rFonts w:cs="Arial"/>
+                <w:color w:val="111827"/>
+                <w:sz w:val="19"/>
+              </w:rPr>
+              <w:t>api</w:t>
+            </w:r>
+            <w:proofErr w:type="spellEnd"/>
+            <w:r>
+              <w:rPr>
+                <w:rFonts w:cs="Arial"/>
+                <w:color w:val="111827"/>
+                <w:sz w:val="19"/>
+              </w:rPr>
+              <w:t>/suggestions</w:t>
             </w:r>
           </w:p>
         </w:tc>
@@ -10638,7 +11189,25 @@
                 <w:color w:val="111827"/>
                 <w:sz w:val="19"/>
               </w:rPr>
-              <w:t>/api/reviews</w:t>
+              <w:t>/</w:t>
+            </w:r>
+            <w:proofErr w:type="spellStart"/>
+            <w:r>
+              <w:rPr>
+                <w:rFonts w:cs="Arial"/>
+                <w:color w:val="111827"/>
+                <w:sz w:val="19"/>
+              </w:rPr>
+              <w:t>api</w:t>
+            </w:r>
+            <w:proofErr w:type="spellEnd"/>
+            <w:r>
+              <w:rPr>
+                <w:rFonts w:cs="Arial"/>
+                <w:color w:val="111827"/>
+                <w:sz w:val="19"/>
+              </w:rPr>
+              <w:t>/reviews</w:t>
             </w:r>
           </w:p>
         </w:tc>
@@ -10699,7 +11268,25 @@
                 <w:color w:val="111827"/>
                 <w:sz w:val="19"/>
               </w:rPr>
-              <w:t>/api/translate</w:t>
+              <w:t>/</w:t>
+            </w:r>
+            <w:proofErr w:type="spellStart"/>
+            <w:r>
+              <w:rPr>
+                <w:rFonts w:cs="Arial"/>
+                <w:color w:val="111827"/>
+                <w:sz w:val="19"/>
+              </w:rPr>
+              <w:t>api</w:t>
+            </w:r>
+            <w:proofErr w:type="spellEnd"/>
+            <w:r>
+              <w:rPr>
+                <w:rFonts w:cs="Arial"/>
+                <w:color w:val="111827"/>
+                <w:sz w:val="19"/>
+              </w:rPr>
+              <w:t>/translate</w:t>
             </w:r>
           </w:p>
         </w:tc>
@@ -10727,7 +11314,25 @@
                 <w:color w:val="111827"/>
                 <w:sz w:val="19"/>
               </w:rPr>
-              <w:t>Prepare DeepL translation through a server-side key.</w:t>
+              <w:t xml:space="preserve">Prepare </w:t>
+            </w:r>
+            <w:proofErr w:type="spellStart"/>
+            <w:r>
+              <w:rPr>
+                <w:rFonts w:cs="Arial"/>
+                <w:color w:val="111827"/>
+                <w:sz w:val="19"/>
+              </w:rPr>
+              <w:t>DeepL</w:t>
+            </w:r>
+            <w:proofErr w:type="spellEnd"/>
+            <w:r>
+              <w:rPr>
+                <w:rFonts w:cs="Arial"/>
+                <w:color w:val="111827"/>
+                <w:sz w:val="19"/>
+              </w:rPr>
+              <w:t xml:space="preserve"> translation through a server-side key.</w:t>
             </w:r>
           </w:p>
         </w:tc>
@@ -10760,8 +11365,36 @@
                 <w:color w:val="111827"/>
                 <w:sz w:val="19"/>
               </w:rPr>
-              <w:t>/api/searchAds</w:t>
+              <w:t>/</w:t>
             </w:r>
+            <w:proofErr w:type="spellStart"/>
+            <w:r>
+              <w:rPr>
+                <w:rFonts w:cs="Arial"/>
+                <w:color w:val="111827"/>
+                <w:sz w:val="19"/>
+              </w:rPr>
+              <w:t>api</w:t>
+            </w:r>
+            <w:proofErr w:type="spellEnd"/>
+            <w:r>
+              <w:rPr>
+                <w:rFonts w:cs="Arial"/>
+                <w:color w:val="111827"/>
+                <w:sz w:val="19"/>
+              </w:rPr>
+              <w:t>/</w:t>
+            </w:r>
+            <w:proofErr w:type="spellStart"/>
+            <w:r>
+              <w:rPr>
+                <w:rFonts w:cs="Arial"/>
+                <w:color w:val="111827"/>
+                <w:sz w:val="19"/>
+              </w:rPr>
+              <w:t>searchAds</w:t>
+            </w:r>
+            <w:proofErr w:type="spellEnd"/>
           </w:p>
         </w:tc>
         <w:tc>
@@ -10821,8 +11454,36 @@
                 <w:color w:val="111827"/>
                 <w:sz w:val="19"/>
               </w:rPr>
-              <w:t>/api/appStoreConnect</w:t>
+              <w:t>/</w:t>
             </w:r>
+            <w:proofErr w:type="spellStart"/>
+            <w:r>
+              <w:rPr>
+                <w:rFonts w:cs="Arial"/>
+                <w:color w:val="111827"/>
+                <w:sz w:val="19"/>
+              </w:rPr>
+              <w:t>api</w:t>
+            </w:r>
+            <w:proofErr w:type="spellEnd"/>
+            <w:r>
+              <w:rPr>
+                <w:rFonts w:cs="Arial"/>
+                <w:color w:val="111827"/>
+                <w:sz w:val="19"/>
+              </w:rPr>
+              <w:t>/</w:t>
+            </w:r>
+            <w:proofErr w:type="spellStart"/>
+            <w:r>
+              <w:rPr>
+                <w:rFonts w:cs="Arial"/>
+                <w:color w:val="111827"/>
+                <w:sz w:val="19"/>
+              </w:rPr>
+              <w:t>appStoreConnect</w:t>
+            </w:r>
+            <w:proofErr w:type="spellEnd"/>
           </w:p>
         </w:tc>
         <w:tc>
@@ -10883,7 +11544,25 @@
                 <w:sz w:val="19"/>
               </w:rPr>
               <w:lastRenderedPageBreak/>
-              <w:t>/api/credentials/status</w:t>
+              <w:t>/</w:t>
+            </w:r>
+            <w:proofErr w:type="spellStart"/>
+            <w:r>
+              <w:rPr>
+                <w:rFonts w:cs="Arial"/>
+                <w:color w:val="111827"/>
+                <w:sz w:val="19"/>
+              </w:rPr>
+              <w:t>api</w:t>
+            </w:r>
+            <w:proofErr w:type="spellEnd"/>
+            <w:r>
+              <w:rPr>
+                <w:rFonts w:cs="Arial"/>
+                <w:color w:val="111827"/>
+                <w:sz w:val="19"/>
+              </w:rPr>
+              <w:t>/credentials/status</w:t>
             </w:r>
           </w:p>
         </w:tc>
@@ -11003,12 +11682,21 @@
           <w:rFonts w:cs="Arial"/>
         </w:rPr>
       </w:pPr>
+      <w:proofErr w:type="spellStart"/>
       <w:r>
         <w:rPr>
           <w:rFonts w:cs="Arial"/>
           <w:sz w:val="20"/>
         </w:rPr>
-        <w:t>FlashRank searches the public App Store result set for that keyword and region.</w:t>
+        <w:t>FlashRank</w:t>
+      </w:r>
+      <w:proofErr w:type="spellEnd"/>
+      <w:r>
+        <w:rPr>
+          <w:rFonts w:cs="Arial"/>
+          <w:sz w:val="20"/>
+        </w:rPr>
+        <w:t xml:space="preserve"> searches the public App Store result set for that keyword and region.</w:t>
       </w:r>
     </w:p>
     <w:p>
@@ -11343,7 +12031,21 @@
         <w:rPr>
           <w:rFonts w:cs="Arial"/>
         </w:rPr>
-        <w:t>Next.js was chosen because FlashRank needs both a rich frontend and server-side routes. A plain React app could handle the UI, but it would still need a separate backend for Apple API proxying, credential handling, review fetching, and future private integrations.</w:t>
+        <w:t xml:space="preserve">Next.js was chosen because </w:t>
+      </w:r>
+      <w:proofErr w:type="spellStart"/>
+      <w:r>
+        <w:rPr>
+          <w:rFonts w:cs="Arial"/>
+        </w:rPr>
+        <w:t>FlashRank</w:t>
+      </w:r>
+      <w:proofErr w:type="spellEnd"/>
+      <w:r>
+        <w:rPr>
+          <w:rFonts w:cs="Arial"/>
+        </w:rPr>
+        <w:t xml:space="preserve"> needs both a rich frontend and server-side routes. A plain React app could handle the UI, but it would still need a separate backend for Apple API proxying, credential handling, review fetching, and future private integrations.</w:t>
       </w:r>
     </w:p>
     <w:p>
@@ -11493,7 +12195,21 @@
         <w:rPr>
           <w:rFonts w:ascii="Arial" w:hAnsi="Arial" w:cs="Arial"/>
         </w:rPr>
-        <w:t>Why Zustand Instead of Redux</w:t>
+        <w:t xml:space="preserve">Why </w:t>
+      </w:r>
+      <w:proofErr w:type="spellStart"/>
+      <w:r>
+        <w:rPr>
+          <w:rFonts w:ascii="Arial" w:hAnsi="Arial" w:cs="Arial"/>
+        </w:rPr>
+        <w:t>Zustand</w:t>
+      </w:r>
+      <w:proofErr w:type="spellEnd"/>
+      <w:r>
+        <w:rPr>
+          <w:rFonts w:ascii="Arial" w:hAnsi="Arial" w:cs="Arial"/>
+        </w:rPr>
+        <w:t xml:space="preserve"> Instead of Redux</w:t>
       </w:r>
       <w:bookmarkEnd w:id="29"/>
     </w:p>
@@ -11507,7 +12223,35 @@
         <w:rPr>
           <w:rFonts w:cs="Arial"/>
         </w:rPr>
-        <w:t>Redux is powerful, but FlashRank does not need the amount of ceremony Redux introduces. Zustand gives the app:</w:t>
+        <w:t xml:space="preserve">Redux is powerful, but </w:t>
+      </w:r>
+      <w:proofErr w:type="spellStart"/>
+      <w:r>
+        <w:rPr>
+          <w:rFonts w:cs="Arial"/>
+        </w:rPr>
+        <w:t>FlashRank</w:t>
+      </w:r>
+      <w:proofErr w:type="spellEnd"/>
+      <w:r>
+        <w:rPr>
+          <w:rFonts w:cs="Arial"/>
+        </w:rPr>
+        <w:t xml:space="preserve"> does not need the amount of ceremony Redux introduces. </w:t>
+      </w:r>
+      <w:proofErr w:type="spellStart"/>
+      <w:r>
+        <w:rPr>
+          <w:rFonts w:cs="Arial"/>
+        </w:rPr>
+        <w:t>Zustand</w:t>
+      </w:r>
+      <w:proofErr w:type="spellEnd"/>
+      <w:r>
+        <w:rPr>
+          <w:rFonts w:cs="Arial"/>
+        </w:rPr>
+        <w:t xml:space="preserve"> gives the app:</w:t>
       </w:r>
     </w:p>
     <w:p>
@@ -11600,7 +12344,21 @@
         <w:rPr>
           <w:rFonts w:cs="Arial"/>
         </w:rPr>
-        <w:t>For this project stage, Zustand is the better tradeoff because the state is complex enough to centralize but not so distributed that Redux is necessary.</w:t>
+        <w:t xml:space="preserve">For this project stage, </w:t>
+      </w:r>
+      <w:proofErr w:type="spellStart"/>
+      <w:r>
+        <w:rPr>
+          <w:rFonts w:cs="Arial"/>
+        </w:rPr>
+        <w:t>Zustand</w:t>
+      </w:r>
+      <w:proofErr w:type="spellEnd"/>
+      <w:r>
+        <w:rPr>
+          <w:rFonts w:cs="Arial"/>
+        </w:rPr>
+        <w:t xml:space="preserve"> is the better tradeoff because the state is complex enough to centralize but not so distributed that Redux is necessary.</w:t>
       </w:r>
     </w:p>
     <w:p>
@@ -11760,12 +12518,20 @@
           <w:rFonts w:cs="Arial"/>
         </w:rPr>
       </w:pPr>
+      <w:proofErr w:type="spellStart"/>
       <w:r>
         <w:rPr>
           <w:rFonts w:cs="Arial"/>
         </w:rPr>
         <w:lastRenderedPageBreak/>
-        <w:t>FlashRank currently uses deterministic estimated popularity so the UI can support sorting, filtering, and prioritization while clearly labeling the value as estimated. This lets the workflow exist before the paid/private data connector is complete.</w:t>
+        <w:t>FlashRank</w:t>
+      </w:r>
+      <w:proofErr w:type="spellEnd"/>
+      <w:r>
+        <w:rPr>
+          <w:rFonts w:cs="Arial"/>
+        </w:rPr>
+        <w:t xml:space="preserve"> currently uses deterministic estimated popularity so the UI can support sorting, filtering, and prioritization while clearly labeling the value as estimated. This lets the workflow exist before the paid/private data connector is complete.</w:t>
       </w:r>
     </w:p>
     <w:p>
@@ -11829,11 +12595,19 @@
           <w:rFonts w:cs="Arial"/>
         </w:rPr>
       </w:pPr>
-      <w:r>
-        <w:rPr>
-          <w:rFonts w:cs="Arial"/>
-        </w:rPr>
-        <w:t>FlashRank combines keyword popularity with top-result competition signals to produce a difficulty score and label.</w:t>
+      <w:proofErr w:type="spellStart"/>
+      <w:r>
+        <w:rPr>
+          <w:rFonts w:cs="Arial"/>
+        </w:rPr>
+        <w:t>FlashRank</w:t>
+      </w:r>
+      <w:proofErr w:type="spellEnd"/>
+      <w:r>
+        <w:rPr>
+          <w:rFonts w:cs="Arial"/>
+        </w:rPr>
+        <w:t xml:space="preserve"> combines keyword popularity with top-result competition signals to produce a difficulty score and label.</w:t>
       </w:r>
     </w:p>
     <w:p>
@@ -11917,7 +12691,21 @@
         <w:rPr>
           <w:rFonts w:cs="Arial"/>
         </w:rPr>
-        <w:t>The tradeoff is that localStorage is per browser/device. A production version would need cloud storage and authentication.</w:t>
+        <w:t xml:space="preserve">The tradeoff is that </w:t>
+      </w:r>
+      <w:proofErr w:type="spellStart"/>
+      <w:r>
+        <w:rPr>
+          <w:rFonts w:cs="Arial"/>
+        </w:rPr>
+        <w:t>localStorage</w:t>
+      </w:r>
+      <w:proofErr w:type="spellEnd"/>
+      <w:r>
+        <w:rPr>
+          <w:rFonts w:cs="Arial"/>
+        </w:rPr>
+        <w:t xml:space="preserve"> is per browser/device. A production version would need cloud storage and authentication.</w:t>
       </w:r>
     </w:p>
     <w:p>
@@ -11942,11 +12730,19 @@
           <w:rFonts w:cs="Arial"/>
         </w:rPr>
       </w:pPr>
-      <w:r>
-        <w:rPr>
-          <w:rFonts w:cs="Arial"/>
-        </w:rPr>
-        <w:t>FlashRank is a work tool, not a landing page. The user needs to scan dense information: keywords, ranks, competitors, difficulty, popularity, regions, and changes.</w:t>
+      <w:proofErr w:type="spellStart"/>
+      <w:r>
+        <w:rPr>
+          <w:rFonts w:cs="Arial"/>
+        </w:rPr>
+        <w:t>FlashRank</w:t>
+      </w:r>
+      <w:proofErr w:type="spellEnd"/>
+      <w:r>
+        <w:rPr>
+          <w:rFonts w:cs="Arial"/>
+        </w:rPr>
+        <w:t xml:space="preserve"> is a work tool, not a landing page. The user needs to scan dense information: keywords, ranks, competitors, difficulty, popularity, regions, and changes.</w:t>
       </w:r>
     </w:p>
     <w:p>
@@ -12139,11 +12935,19 @@
           <w:rFonts w:cs="Arial"/>
         </w:rPr>
       </w:pPr>
-      <w:r>
-        <w:rPr>
-          <w:rFonts w:cs="Arial"/>
-        </w:rPr>
-        <w:t>FlashRank separates data into three categories:</w:t>
+      <w:proofErr w:type="spellStart"/>
+      <w:r>
+        <w:rPr>
+          <w:rFonts w:cs="Arial"/>
+        </w:rPr>
+        <w:t>FlashRank</w:t>
+      </w:r>
+      <w:proofErr w:type="spellEnd"/>
+      <w:r>
+        <w:rPr>
+          <w:rFonts w:cs="Arial"/>
+        </w:rPr>
+        <w:t xml:space="preserve"> separates data into three categories:</w:t>
       </w:r>
     </w:p>
     <w:tbl>
@@ -12638,20 +13442,44 @@
           <w:rFonts w:cs="Arial"/>
           <w:sz w:val="20"/>
         </w:rPr>
-        <w:t>The refresh failed, and FlashRank preserved the previous valid state rather than overwriting it with fake data.</w:t>
-      </w:r>
-    </w:p>
-    <w:p>
-      <w:pPr>
-        <w:rPr>
-          <w:rFonts w:cs="Arial"/>
-        </w:rPr>
-      </w:pPr>
-      <w:r>
-        <w:rPr>
-          <w:rFonts w:cs="Arial"/>
-        </w:rPr>
-        <w:t>FlashRank uses rank statuses such as ranked, unranked, pending, error, and no-app to make these cases clearer.</w:t>
+        <w:t xml:space="preserve">The refresh failed, and </w:t>
+      </w:r>
+      <w:proofErr w:type="spellStart"/>
+      <w:r>
+        <w:rPr>
+          <w:rFonts w:cs="Arial"/>
+          <w:sz w:val="20"/>
+        </w:rPr>
+        <w:t>FlashRank</w:t>
+      </w:r>
+      <w:proofErr w:type="spellEnd"/>
+      <w:r>
+        <w:rPr>
+          <w:rFonts w:cs="Arial"/>
+          <w:sz w:val="20"/>
+        </w:rPr>
+        <w:t xml:space="preserve"> preserved the previous valid state rather than overwriting it with fake data.</w:t>
+      </w:r>
+    </w:p>
+    <w:p>
+      <w:pPr>
+        <w:rPr>
+          <w:rFonts w:cs="Arial"/>
+        </w:rPr>
+      </w:pPr>
+      <w:proofErr w:type="spellStart"/>
+      <w:r>
+        <w:rPr>
+          <w:rFonts w:cs="Arial"/>
+        </w:rPr>
+        <w:t>FlashRank</w:t>
+      </w:r>
+      <w:proofErr w:type="spellEnd"/>
+      <w:r>
+        <w:rPr>
+          <w:rFonts w:cs="Arial"/>
+        </w:rPr>
+        <w:t xml:space="preserve"> uses rank statuses such as ranked, unranked, pending, error, and no-app to make these cases clearer.</w:t>
       </w:r>
     </w:p>
     <w:p>
@@ -12666,7 +13494,21 @@
         <w:rPr>
           <w:rFonts w:ascii="Arial" w:hAnsi="Arial" w:cs="Arial"/>
         </w:rPr>
-        <w:t>What FlashRank Does Not Fake</w:t>
+        <w:t xml:space="preserve">What </w:t>
+      </w:r>
+      <w:proofErr w:type="spellStart"/>
+      <w:r>
+        <w:rPr>
+          <w:rFonts w:ascii="Arial" w:hAnsi="Arial" w:cs="Arial"/>
+        </w:rPr>
+        <w:t>FlashRank</w:t>
+      </w:r>
+      <w:proofErr w:type="spellEnd"/>
+      <w:r>
+        <w:rPr>
+          <w:rFonts w:ascii="Arial" w:hAnsi="Arial" w:cs="Arial"/>
+        </w:rPr>
+        <w:t xml:space="preserve"> Does Not Fake</w:t>
       </w:r>
       <w:bookmarkEnd w:id="38"/>
     </w:p>
@@ -12676,11 +13518,19 @@
           <w:rFonts w:cs="Arial"/>
         </w:rPr>
       </w:pPr>
-      <w:r>
-        <w:rPr>
-          <w:rFonts w:cs="Arial"/>
-        </w:rPr>
-        <w:t>FlashRank does not fake:</w:t>
+      <w:proofErr w:type="spellStart"/>
+      <w:r>
+        <w:rPr>
+          <w:rFonts w:cs="Arial"/>
+        </w:rPr>
+        <w:t>FlashRank</w:t>
+      </w:r>
+      <w:proofErr w:type="spellEnd"/>
+      <w:r>
+        <w:rPr>
+          <w:rFonts w:cs="Arial"/>
+        </w:rPr>
+        <w:t xml:space="preserve"> does not fake:</w:t>
       </w:r>
     </w:p>
     <w:p>
@@ -12935,7 +13785,23 @@
           <w:rFonts w:cs="Arial"/>
           <w:sz w:val="20"/>
         </w:rPr>
-        <w:t>Let FlashRank hydrate starter keyword ideas.</w:t>
+        <w:t xml:space="preserve">Let </w:t>
+      </w:r>
+      <w:proofErr w:type="spellStart"/>
+      <w:r>
+        <w:rPr>
+          <w:rFonts w:cs="Arial"/>
+          <w:sz w:val="20"/>
+        </w:rPr>
+        <w:t>FlashRank</w:t>
+      </w:r>
+      <w:proofErr w:type="spellEnd"/>
+      <w:r>
+        <w:rPr>
+          <w:rFonts w:cs="Arial"/>
+          <w:sz w:val="20"/>
+        </w:rPr>
+        <w:t xml:space="preserve"> hydrate starter keyword ideas.</w:t>
       </w:r>
     </w:p>
     <w:p>
@@ -13467,11 +14333,19 @@
           <w:rFonts w:cs="Arial"/>
         </w:rPr>
       </w:pPr>
-      <w:r>
-        <w:rPr>
-          <w:rFonts w:cs="Arial"/>
-        </w:rPr>
-        <w:t>FlashRank verifies that:</w:t>
+      <w:proofErr w:type="spellStart"/>
+      <w:r>
+        <w:rPr>
+          <w:rFonts w:cs="Arial"/>
+        </w:rPr>
+        <w:t>FlashRank</w:t>
+      </w:r>
+      <w:proofErr w:type="spellEnd"/>
+      <w:r>
+        <w:rPr>
+          <w:rFonts w:cs="Arial"/>
+        </w:rPr>
+        <w:t xml:space="preserve"> verifies that:</w:t>
       </w:r>
     </w:p>
     <w:p>
@@ -13535,7 +14409,23 @@
           <w:rFonts w:cs="Arial"/>
           <w:sz w:val="20"/>
         </w:rPr>
-        <w:t>Translation routes show key-required behavior when DeepL is not configured.</w:t>
+        <w:t xml:space="preserve">Translation routes show key-required behavior when </w:t>
+      </w:r>
+      <w:proofErr w:type="spellStart"/>
+      <w:r>
+        <w:rPr>
+          <w:rFonts w:cs="Arial"/>
+          <w:sz w:val="20"/>
+        </w:rPr>
+        <w:t>DeepL</w:t>
+      </w:r>
+      <w:proofErr w:type="spellEnd"/>
+      <w:r>
+        <w:rPr>
+          <w:rFonts w:cs="Arial"/>
+          <w:sz w:val="20"/>
+        </w:rPr>
+        <w:t xml:space="preserve"> is not configured.</w:t>
       </w:r>
     </w:p>
     <w:p>
@@ -13568,11 +14458,19 @@
           <w:rFonts w:cs="Arial"/>
         </w:rPr>
       </w:pPr>
-      <w:r>
-        <w:rPr>
-          <w:rFonts w:cs="Arial"/>
-        </w:rPr>
-        <w:t>FlashRank verifies that:</w:t>
+      <w:proofErr w:type="spellStart"/>
+      <w:r>
+        <w:rPr>
+          <w:rFonts w:cs="Arial"/>
+        </w:rPr>
+        <w:t>FlashRank</w:t>
+      </w:r>
+      <w:proofErr w:type="spellEnd"/>
+      <w:r>
+        <w:rPr>
+          <w:rFonts w:cs="Arial"/>
+        </w:rPr>
+        <w:t xml:space="preserve"> verifies that:</w:t>
       </w:r>
     </w:p>
     <w:p>
@@ -13653,11 +14551,19 @@
           <w:rFonts w:cs="Arial"/>
         </w:rPr>
       </w:pPr>
-      <w:r>
-        <w:rPr>
-          <w:rFonts w:cs="Arial"/>
-        </w:rPr>
-        <w:t>FlashRank verifies that:</w:t>
+      <w:proofErr w:type="spellStart"/>
+      <w:r>
+        <w:rPr>
+          <w:rFonts w:cs="Arial"/>
+        </w:rPr>
+        <w:t>FlashRank</w:t>
+      </w:r>
+      <w:proofErr w:type="spellEnd"/>
+      <w:r>
+        <w:rPr>
+          <w:rFonts w:cs="Arial"/>
+        </w:rPr>
+        <w:t xml:space="preserve"> verifies that:</w:t>
       </w:r>
     </w:p>
     <w:p>
@@ -13913,11 +14819,19 @@
           <w:rFonts w:cs="Arial"/>
         </w:rPr>
       </w:pPr>
-      <w:r>
-        <w:rPr>
-          <w:rFonts w:cs="Arial"/>
-        </w:rPr>
-        <w:t>FlashRank prepares for API keys but avoids putting private secrets directly in browser code.</w:t>
+      <w:proofErr w:type="spellStart"/>
+      <w:r>
+        <w:rPr>
+          <w:rFonts w:cs="Arial"/>
+        </w:rPr>
+        <w:t>FlashRank</w:t>
+      </w:r>
+      <w:proofErr w:type="spellEnd"/>
+      <w:r>
+        <w:rPr>
+          <w:rFonts w:cs="Arial"/>
+        </w:rPr>
+        <w:t xml:space="preserve"> prepares for API keys but avoids putting private secrets directly in browser code.</w:t>
       </w:r>
     </w:p>
     <w:p>
@@ -14033,7 +14947,23 @@
           <w:rFonts w:cs="Arial"/>
           <w:sz w:val="20"/>
         </w:rPr>
-        <w:t>No private key values in client logs or localStorage.</w:t>
+        <w:t xml:space="preserve">No private key values in client logs or </w:t>
+      </w:r>
+      <w:proofErr w:type="spellStart"/>
+      <w:r>
+        <w:rPr>
+          <w:rFonts w:cs="Arial"/>
+          <w:sz w:val="20"/>
+        </w:rPr>
+        <w:t>localStorage</w:t>
+      </w:r>
+      <w:proofErr w:type="spellEnd"/>
+      <w:r>
+        <w:rPr>
+          <w:rFonts w:cs="Arial"/>
+          <w:sz w:val="20"/>
+        </w:rPr>
+        <w:t>.</w:t>
       </w:r>
     </w:p>
     <w:p>

</xml_diff>